<commit_message>
docs(accessibilite) update artefacts v3.1
</commit_message>
<xml_diff>
--- a/docs/cadrage/artefacts/accessibilite/equipe-11-persona-v3.1.docx
+++ b/docs/cadrage/artefacts/accessibilite/equipe-11-persona-v3.1.docx
@@ -424,7 +424,7 @@
                 <w:color w:val="0000ff"/>
                 <w:rtl w:val="0"/>
               </w:rPr>
-              <w:t xml:space="preserve">v3.0</w:t>
+              <w:t xml:space="preserve">v3.1</w:t>
             </w:r>
           </w:p>
         </w:tc>
@@ -612,7 +612,7 @@
     </w:p>
     <w:sdt>
       <w:sdtPr>
-        <w:id w:val="583283225"/>
+        <w:id w:val="-1490792632"/>
         <w:docPartObj>
           <w:docPartGallery w:val="Table of Contents"/>
           <w:docPartUnique w:val="1"/>
@@ -5939,7 +5939,14 @@
           <w:color w:val="1e1b4b"/>
           <w:rtl w:val="0"/>
         </w:rPr>
-        <w:t xml:space="preserve">1.1. Identité</w:t>
+        <w:t xml:space="preserve">3</w:t>
+      </w:r>
+      <w:r>
+        <w:rPr>
+          <w:color w:val="1e1b4b"/>
+          <w:rtl w:val="0"/>
+        </w:rPr>
+        <w:t xml:space="preserve">.1. Identité</w:t>
       </w:r>
       <w:r>
         <w:rPr>
@@ -6231,7 +6238,7 @@
           <w:color w:val="1e1b4b"/>
           <w:rtl w:val="0"/>
         </w:rPr>
-        <w:t xml:space="preserve">1.2. Contexte d'usage</w:t>
+        <w:t xml:space="preserve">3.2. Contexte d'usage</w:t>
       </w:r>
       <w:r>
         <w:rPr>
@@ -6272,7 +6279,14 @@
           <w:color w:val="1e1b4b"/>
           <w:rtl w:val="0"/>
         </w:rPr>
-        <w:t xml:space="preserve">1.3. Compétences numériques</w:t>
+        <w:t xml:space="preserve">3</w:t>
+      </w:r>
+      <w:r>
+        <w:rPr>
+          <w:color w:val="1e1b4b"/>
+          <w:rtl w:val="0"/>
+        </w:rPr>
+        <w:t xml:space="preserve">.3. Compétences numériques</w:t>
       </w:r>
       <w:r>
         <w:rPr>
@@ -6332,7 +6346,14 @@
           <w:color w:val="1e1b4b"/>
           <w:rtl w:val="0"/>
         </w:rPr>
-        <w:t xml:space="preserve">1.4. Frustrations / pain points (chiffrés)</w:t>
+        <w:t xml:space="preserve">3</w:t>
+      </w:r>
+      <w:r>
+        <w:rPr>
+          <w:color w:val="1e1b4b"/>
+          <w:rtl w:val="0"/>
+        </w:rPr>
+        <w:t xml:space="preserve">.4. Frustrations / pain points (chiffrés)</w:t>
       </w:r>
       <w:r>
         <w:rPr>
@@ -6375,7 +6396,7 @@
           <w:color w:val="1e1b4b"/>
           <w:rtl w:val="0"/>
         </w:rPr>
-        <w:t xml:space="preserve">1.5. Objectifs (jobs-to-be-done, SMART)</w:t>
+        <w:t xml:space="preserve">3.5. Objectifs (jobs-to-be-done, SMART)</w:t>
       </w:r>
       <w:r>
         <w:rPr>
@@ -6416,7 +6437,14 @@
           <w:color w:val="1e1b4b"/>
           <w:rtl w:val="0"/>
         </w:rPr>
-        <w:t xml:space="preserve">1.6. Critères de succès personnels (du point de vue persona)</w:t>
+        <w:t xml:space="preserve">3</w:t>
+      </w:r>
+      <w:r>
+        <w:rPr>
+          <w:color w:val="1e1b4b"/>
+          <w:rtl w:val="0"/>
+        </w:rPr>
+        <w:t xml:space="preserve">.6. Critères de succès personnels (du point de vue persona)</w:t>
       </w:r>
       <w:r>
         <w:rPr>

</xml_diff>